<commit_message>
Add Dataset Analyzer app, sample datasets, and GitHub Pages landing page
Adds a general-purpose Decision Tree dataset analyzer (upload any CSV,
train, view accuracy/confusion matrix/tree), a script to fetch 11 sample
Kaggle datasets, live demo screenshots, an updated proposal with code
appendix and screenshots, and a static docs/ landing page for GitHub Pages.

Co-Authored-By: Claude Sonnet 5 <noreply@anthropic.com>
</commit_message>
<xml_diff>
--- a/Mental_Health_Stress_Predictor_Proposal.docx
+++ b/Mental_Health_Stress_Predictor_Proposal.docx
@@ -66,7 +66,7 @@
           <w:color w:val="1F3A5F"/>
           <w:sz w:val="26"/>
         </w:rPr>
-        <w:t>Group Member</w:t>
+        <w:t>Group Members</w:t>
       </w:r>
     </w:p>
     <w:tbl>
@@ -77,14 +77,14 @@
         <w:tblLook w:firstColumn="1" w:firstRow="1" w:lastColumn="0" w:lastRow="0" w:noHBand="0" w:noVBand="1" w:val="04A0"/>
       </w:tblPr>
       <w:tblGrid>
-        <w:gridCol w:w="3280"/>
-        <w:gridCol w:w="3280"/>
-        <w:gridCol w:w="3280"/>
+        <w:gridCol w:w="3347"/>
+        <w:gridCol w:w="3347"/>
+        <w:gridCol w:w="3347"/>
       </w:tblGrid>
       <w:tr>
         <w:tc>
           <w:tcPr>
-            <w:tcW w:type="dxa" w:w="3280"/>
+            <w:tcW w:type="dxa" w:w="3347"/>
             <w:shd w:val="clear" w:color="auto" w:fill="1F3A5F"/>
           </w:tcPr>
           <w:p>
@@ -101,7 +101,7 @@
         </w:tc>
         <w:tc>
           <w:tcPr>
-            <w:tcW w:type="dxa" w:w="3280"/>
+            <w:tcW w:type="dxa" w:w="3347"/>
             <w:shd w:val="clear" w:color="auto" w:fill="1F3A5F"/>
           </w:tcPr>
           <w:p>
@@ -118,7 +118,7 @@
         </w:tc>
         <w:tc>
           <w:tcPr>
-            <w:tcW w:type="dxa" w:w="3280"/>
+            <w:tcW w:type="dxa" w:w="3347"/>
             <w:shd w:val="clear" w:color="auto" w:fill="1F3A5F"/>
           </w:tcPr>
           <w:p>
@@ -137,7 +137,7 @@
       <w:tr>
         <w:tc>
           <w:tcPr>
-            <w:tcW w:type="dxa" w:w="3280"/>
+            <w:tcW w:type="dxa" w:w="3347"/>
           </w:tcPr>
           <w:p>
             <w:r/>
@@ -151,7 +151,7 @@
         </w:tc>
         <w:tc>
           <w:tcPr>
-            <w:tcW w:type="dxa" w:w="3280"/>
+            <w:tcW w:type="dxa" w:w="3347"/>
           </w:tcPr>
           <w:p>
             <w:r/>
@@ -165,7 +165,7 @@
         </w:tc>
         <w:tc>
           <w:tcPr>
-            <w:tcW w:type="dxa" w:w="3280"/>
+            <w:tcW w:type="dxa" w:w="3347"/>
           </w:tcPr>
           <w:p>
             <w:r/>
@@ -174,6 +174,50 @@
                 <w:sz w:val="21"/>
               </w:rPr>
               <w:t>IU04-0320-0277</w:t>
+            </w:r>
+          </w:p>
+        </w:tc>
+      </w:tr>
+      <w:tr>
+        <w:tc>
+          <w:tcPr>
+            <w:tcW w:type="dxa" w:w="3347"/>
+          </w:tcPr>
+          <w:p>
+            <w:r/>
+            <w:r>
+              <w:rPr>
+                <w:sz w:val="21"/>
+              </w:rPr>
+              <w:t>2</w:t>
+            </w:r>
+          </w:p>
+        </w:tc>
+        <w:tc>
+          <w:tcPr>
+            <w:tcW w:type="dxa" w:w="3347"/>
+          </w:tcPr>
+          <w:p>
+            <w:r/>
+            <w:r>
+              <w:rPr>
+                <w:sz w:val="21"/>
+              </w:rPr>
+              <w:t>Ali Raza</w:t>
+            </w:r>
+          </w:p>
+        </w:tc>
+        <w:tc>
+          <w:tcPr>
+            <w:tcW w:type="dxa" w:w="3347"/>
+          </w:tcPr>
+          <w:p>
+            <w:r/>
+            <w:r>
+              <w:rPr>
+                <w:sz w:val="21"/>
+              </w:rPr>
+              <w:t>IU04-0320-0281</w:t>
             </w:r>
           </w:p>
         </w:tc>
@@ -212,6 +256,17 @@
           <w:sz w:val="21"/>
         </w:rPr>
         <w:t>This project builds a machine learning classification system that takes a person's daily routine as input (sleep hours, study/work hours, screen time, physical activity, pressure score, diet quality) via a simple questionnaire/form, and predicts their stress level as Low, Medium, or High. The data is cleaned, encoded, and scaled; Logistic Regression and Random Forest classifiers are trained and compared; and the best-performing model is used to generate predictions for new user input.</w:t>
+      </w:r>
+    </w:p>
+    <w:p>
+      <w:pPr>
+        <w:spacing w:after="120"/>
+      </w:pPr>
+      <w:r>
+        <w:rPr>
+          <w:sz w:val="21"/>
+        </w:rPr>
+        <w:t>As an extension, a general-purpose Decision Tree analyzer web app was also built: it lets any CSV dataset be uploaded, automatically encodes and splits the data, trains a Decision Tree Classifier, and reports test accuracy, a confusion matrix, and a visual picture of the tree's decision-making structure. This demonstrates that the same pipeline generalizes beyond the stress dataset to any tabular classification problem.</w:t>
       </w:r>
     </w:p>
     <w:p>
@@ -258,9 +313,2322 @@
         <w:t>https://www.kaggle.com/datasets/rxnach/student-stress-factors-a-comprehensive-analysis</w:t>
       </w:r>
     </w:p>
+    <w:p>
+      <w:r>
+        <w:br w:type="page"/>
+      </w:r>
+    </w:p>
+    <w:p>
+      <w:pPr>
+        <w:spacing w:before="200" w:after="80"/>
+      </w:pPr>
+      <w:r>
+        <w:rPr>
+          <w:b/>
+          <w:color w:val="1F3A5F"/>
+          <w:sz w:val="26"/>
+        </w:rPr>
+        <w:t>3. Code Implementation</w:t>
+      </w:r>
+    </w:p>
+    <w:p>
+      <w:pPr>
+        <w:spacing w:after="120"/>
+      </w:pPr>
+      <w:r>
+        <w:rPr>
+          <w:sz w:val="21"/>
+        </w:rPr>
+        <w:t>Below is the source code for the Dataset Analyzer web app (dataset_analyzer_app.py). This Streamlit application allows any CSV dataset to be uploaded, lets the user choose the target and feature columns, trains a Decision Tree Classifier, and displays a full report (test accuracy, classification report, confusion matrix, and the decision tree diagram).</w:t>
+      </w:r>
+    </w:p>
+    <w:tbl>
+      <w:tblPr>
+        <w:tblW w:type="auto" w:w="0"/>
+        <w:jc w:val="center"/>
+        <w:tblLook w:firstColumn="1" w:firstRow="1" w:lastColumn="0" w:lastRow="0" w:noHBand="0" w:noVBand="1" w:val="04A0"/>
+      </w:tblPr>
+      <w:tblGrid>
+        <w:gridCol w:w="10040"/>
+      </w:tblGrid>
+      <w:tr>
+        <w:tc>
+          <w:tcPr>
+            <w:tcW w:type="dxa" w:w="10040"/>
+            <w:shd w:val="clear" w:color="auto" w:fill="F2F2F2"/>
+          </w:tcPr>
+          <w:p>
+            <w:pPr>
+              <w:spacing w:after="0" w:before="0"/>
+            </w:pPr>
+            <w:r>
+              <w:rPr>
+                <w:rFonts w:ascii="Consolas" w:hAnsi="Consolas"/>
+                <w:sz w:val="15"/>
+              </w:rPr>
+              <w:t>"""</w:t>
+            </w:r>
+          </w:p>
+          <w:p>
+            <w:pPr>
+              <w:spacing w:after="0" w:before="0"/>
+            </w:pPr>
+            <w:r>
+              <w:rPr>
+                <w:rFonts w:ascii="Consolas" w:hAnsi="Consolas"/>
+                <w:sz w:val="15"/>
+              </w:rPr>
+              <w:t>dataset_analyzer_app.py</w:t>
+            </w:r>
+          </w:p>
+          <w:p>
+            <w:pPr>
+              <w:spacing w:after="0" w:before="0"/>
+            </w:pPr>
+            <w:r>
+              <w:rPr>
+                <w:rFonts w:ascii="Consolas" w:hAnsi="Consolas"/>
+                <w:sz w:val="15"/>
+              </w:rPr>
+              <w:t xml:space="preserve"> </w:t>
+            </w:r>
+          </w:p>
+          <w:p>
+            <w:pPr>
+              <w:spacing w:after="0" w:before="0"/>
+            </w:pPr>
+            <w:r>
+              <w:rPr>
+                <w:rFonts w:ascii="Consolas" w:hAnsi="Consolas"/>
+                <w:sz w:val="15"/>
+              </w:rPr>
+              <w:t>A SIMPLE webpage (Streamlit) where you can:</w:t>
+            </w:r>
+          </w:p>
+          <w:p>
+            <w:pPr>
+              <w:spacing w:after="0" w:before="0"/>
+            </w:pPr>
+            <w:r>
+              <w:rPr>
+                <w:rFonts w:ascii="Consolas" w:hAnsi="Consolas"/>
+                <w:sz w:val="15"/>
+              </w:rPr>
+              <w:t>1. Upload ANY dataset (CSV file) - for example, one downloaded from GitHub/Kaggle.</w:t>
+            </w:r>
+          </w:p>
+          <w:p>
+            <w:pPr>
+              <w:spacing w:after="0" w:before="0"/>
+            </w:pPr>
+            <w:r>
+              <w:rPr>
+                <w:rFonts w:ascii="Consolas" w:hAnsi="Consolas"/>
+                <w:sz w:val="15"/>
+              </w:rPr>
+              <w:t>2. Pick which column is the "target" (the thing you want to predict).</w:t>
+            </w:r>
+          </w:p>
+          <w:p>
+            <w:pPr>
+              <w:spacing w:after="0" w:before="0"/>
+            </w:pPr>
+            <w:r>
+              <w:rPr>
+                <w:rFonts w:ascii="Consolas" w:hAnsi="Consolas"/>
+                <w:sz w:val="15"/>
+              </w:rPr>
+              <w:t>3. Pick which columns are "features" (the inputs used to predict the target).</w:t>
+            </w:r>
+          </w:p>
+          <w:p>
+            <w:pPr>
+              <w:spacing w:after="0" w:before="0"/>
+            </w:pPr>
+            <w:r>
+              <w:rPr>
+                <w:rFonts w:ascii="Consolas" w:hAnsi="Consolas"/>
+                <w:sz w:val="15"/>
+              </w:rPr>
+              <w:t>4. The app trains a Decision Tree Classifier on that data.</w:t>
+            </w:r>
+          </w:p>
+          <w:p>
+            <w:pPr>
+              <w:spacing w:after="0" w:before="0"/>
+            </w:pPr>
+            <w:r>
+              <w:rPr>
+                <w:rFonts w:ascii="Consolas" w:hAnsi="Consolas"/>
+                <w:sz w:val="15"/>
+              </w:rPr>
+              <w:t>5. The app shows you a full report: test accuracy, a confusion matrix graph,</w:t>
+            </w:r>
+          </w:p>
+          <w:p>
+            <w:pPr>
+              <w:spacing w:after="0" w:before="0"/>
+            </w:pPr>
+            <w:r>
+              <w:rPr>
+                <w:rFonts w:ascii="Consolas" w:hAnsi="Consolas"/>
+                <w:sz w:val="15"/>
+              </w:rPr>
+              <w:t xml:space="preserve">   a table comparing actual vs predicted values on the test set (X_test/y_test),</w:t>
+            </w:r>
+          </w:p>
+          <w:p>
+            <w:pPr>
+              <w:spacing w:after="0" w:before="0"/>
+            </w:pPr>
+            <w:r>
+              <w:rPr>
+                <w:rFonts w:ascii="Consolas" w:hAnsi="Consolas"/>
+                <w:sz w:val="15"/>
+              </w:rPr>
+              <w:t xml:space="preserve">   and a picture of the actual decision tree the model built.</w:t>
+            </w:r>
+          </w:p>
+          <w:p>
+            <w:pPr>
+              <w:spacing w:after="0" w:before="0"/>
+            </w:pPr>
+            <w:r>
+              <w:rPr>
+                <w:rFonts w:ascii="Consolas" w:hAnsi="Consolas"/>
+                <w:sz w:val="15"/>
+              </w:rPr>
+              <w:t xml:space="preserve"> </w:t>
+            </w:r>
+          </w:p>
+          <w:p>
+            <w:pPr>
+              <w:spacing w:after="0" w:before="0"/>
+            </w:pPr>
+            <w:r>
+              <w:rPr>
+                <w:rFonts w:ascii="Consolas" w:hAnsi="Consolas"/>
+                <w:sz w:val="15"/>
+              </w:rPr>
+              <w:t>To run this app:</w:t>
+            </w:r>
+          </w:p>
+          <w:p>
+            <w:pPr>
+              <w:spacing w:after="0" w:before="0"/>
+            </w:pPr>
+            <w:r>
+              <w:rPr>
+                <w:rFonts w:ascii="Consolas" w:hAnsi="Consolas"/>
+                <w:sz w:val="15"/>
+              </w:rPr>
+              <w:t xml:space="preserve">    streamlit run dataset_analyzer_app.py</w:t>
+            </w:r>
+          </w:p>
+          <w:p>
+            <w:pPr>
+              <w:spacing w:after="0" w:before="0"/>
+            </w:pPr>
+            <w:r>
+              <w:rPr>
+                <w:rFonts w:ascii="Consolas" w:hAnsi="Consolas"/>
+                <w:sz w:val="15"/>
+              </w:rPr>
+              <w:t>"""</w:t>
+            </w:r>
+          </w:p>
+          <w:p>
+            <w:pPr>
+              <w:spacing w:after="0" w:before="0"/>
+            </w:pPr>
+            <w:r>
+              <w:rPr>
+                <w:rFonts w:ascii="Consolas" w:hAnsi="Consolas"/>
+                <w:sz w:val="15"/>
+              </w:rPr>
+              <w:t xml:space="preserve"> </w:t>
+            </w:r>
+          </w:p>
+          <w:p>
+            <w:pPr>
+              <w:spacing w:after="0" w:before="0"/>
+            </w:pPr>
+            <w:r>
+              <w:rPr>
+                <w:rFonts w:ascii="Consolas" w:hAnsi="Consolas"/>
+                <w:sz w:val="15"/>
+              </w:rPr>
+              <w:t>import streamlit as st</w:t>
+            </w:r>
+          </w:p>
+          <w:p>
+            <w:pPr>
+              <w:spacing w:after="0" w:before="0"/>
+            </w:pPr>
+            <w:r>
+              <w:rPr>
+                <w:rFonts w:ascii="Consolas" w:hAnsi="Consolas"/>
+                <w:sz w:val="15"/>
+              </w:rPr>
+              <w:t>import pandas as pd</w:t>
+            </w:r>
+          </w:p>
+          <w:p>
+            <w:pPr>
+              <w:spacing w:after="0" w:before="0"/>
+            </w:pPr>
+            <w:r>
+              <w:rPr>
+                <w:rFonts w:ascii="Consolas" w:hAnsi="Consolas"/>
+                <w:sz w:val="15"/>
+              </w:rPr>
+              <w:t>import matplotlib.pyplot as plt</w:t>
+            </w:r>
+          </w:p>
+          <w:p>
+            <w:pPr>
+              <w:spacing w:after="0" w:before="0"/>
+            </w:pPr>
+            <w:r>
+              <w:rPr>
+                <w:rFonts w:ascii="Consolas" w:hAnsi="Consolas"/>
+                <w:sz w:val="15"/>
+              </w:rPr>
+              <w:t>import seaborn as sns</w:t>
+            </w:r>
+          </w:p>
+          <w:p>
+            <w:pPr>
+              <w:spacing w:after="0" w:before="0"/>
+            </w:pPr>
+            <w:r>
+              <w:rPr>
+                <w:rFonts w:ascii="Consolas" w:hAnsi="Consolas"/>
+                <w:sz w:val="15"/>
+              </w:rPr>
+              <w:t xml:space="preserve"> </w:t>
+            </w:r>
+          </w:p>
+          <w:p>
+            <w:pPr>
+              <w:spacing w:after="0" w:before="0"/>
+            </w:pPr>
+            <w:r>
+              <w:rPr>
+                <w:rFonts w:ascii="Consolas" w:hAnsi="Consolas"/>
+                <w:sz w:val="15"/>
+              </w:rPr>
+              <w:t>from sklearn.model_selection import train_test_split</w:t>
+            </w:r>
+          </w:p>
+          <w:p>
+            <w:pPr>
+              <w:spacing w:after="0" w:before="0"/>
+            </w:pPr>
+            <w:r>
+              <w:rPr>
+                <w:rFonts w:ascii="Consolas" w:hAnsi="Consolas"/>
+                <w:sz w:val="15"/>
+              </w:rPr>
+              <w:t>from sklearn.preprocessing import LabelEncoder</w:t>
+            </w:r>
+          </w:p>
+          <w:p>
+            <w:pPr>
+              <w:spacing w:after="0" w:before="0"/>
+            </w:pPr>
+            <w:r>
+              <w:rPr>
+                <w:rFonts w:ascii="Consolas" w:hAnsi="Consolas"/>
+                <w:sz w:val="15"/>
+              </w:rPr>
+              <w:t>from sklearn.tree import DecisionTreeClassifier, plot_tree</w:t>
+            </w:r>
+          </w:p>
+          <w:p>
+            <w:pPr>
+              <w:spacing w:after="0" w:before="0"/>
+            </w:pPr>
+            <w:r>
+              <w:rPr>
+                <w:rFonts w:ascii="Consolas" w:hAnsi="Consolas"/>
+                <w:sz w:val="15"/>
+              </w:rPr>
+              <w:t>from sklearn.metrics import accuracy_score, classification_report, confusion_matrix</w:t>
+            </w:r>
+          </w:p>
+          <w:p>
+            <w:pPr>
+              <w:spacing w:after="0" w:before="0"/>
+            </w:pPr>
+            <w:r>
+              <w:rPr>
+                <w:rFonts w:ascii="Consolas" w:hAnsi="Consolas"/>
+                <w:sz w:val="15"/>
+              </w:rPr>
+              <w:t xml:space="preserve"> </w:t>
+            </w:r>
+          </w:p>
+          <w:p>
+            <w:pPr>
+              <w:spacing w:after="0" w:before="0"/>
+            </w:pPr>
+            <w:r>
+              <w:rPr>
+                <w:rFonts w:ascii="Consolas" w:hAnsi="Consolas"/>
+                <w:sz w:val="15"/>
+              </w:rPr>
+              <w:t># -----------------------------------------------------------------</w:t>
+            </w:r>
+          </w:p>
+          <w:p>
+            <w:pPr>
+              <w:spacing w:after="0" w:before="0"/>
+            </w:pPr>
+            <w:r>
+              <w:rPr>
+                <w:rFonts w:ascii="Consolas" w:hAnsi="Consolas"/>
+                <w:sz w:val="15"/>
+              </w:rPr>
+              <w:t># Page setup</w:t>
+            </w:r>
+          </w:p>
+          <w:p>
+            <w:pPr>
+              <w:spacing w:after="0" w:before="0"/>
+            </w:pPr>
+            <w:r>
+              <w:rPr>
+                <w:rFonts w:ascii="Consolas" w:hAnsi="Consolas"/>
+                <w:sz w:val="15"/>
+              </w:rPr>
+              <w:t># -----------------------------------------------------------------</w:t>
+            </w:r>
+          </w:p>
+          <w:p>
+            <w:pPr>
+              <w:spacing w:after="0" w:before="0"/>
+            </w:pPr>
+            <w:r>
+              <w:rPr>
+                <w:rFonts w:ascii="Consolas" w:hAnsi="Consolas"/>
+                <w:sz w:val="15"/>
+              </w:rPr>
+              <w:t>st.title("Dataset Analyzer - Decision Tree Classifier")</w:t>
+            </w:r>
+          </w:p>
+          <w:p>
+            <w:pPr>
+              <w:spacing w:after="0" w:before="0"/>
+            </w:pPr>
+            <w:r>
+              <w:rPr>
+                <w:rFonts w:ascii="Consolas" w:hAnsi="Consolas"/>
+                <w:sz w:val="15"/>
+              </w:rPr>
+              <w:t>st.write(</w:t>
+            </w:r>
+          </w:p>
+          <w:p>
+            <w:pPr>
+              <w:spacing w:after="0" w:before="0"/>
+            </w:pPr>
+            <w:r>
+              <w:rPr>
+                <w:rFonts w:ascii="Consolas" w:hAnsi="Consolas"/>
+                <w:sz w:val="15"/>
+              </w:rPr>
+              <w:t xml:space="preserve">    "Upload a CSV dataset, choose the column you want to predict, and this "</w:t>
+            </w:r>
+          </w:p>
+          <w:p>
+            <w:pPr>
+              <w:spacing w:after="0" w:before="0"/>
+            </w:pPr>
+            <w:r>
+              <w:rPr>
+                <w:rFonts w:ascii="Consolas" w:hAnsi="Consolas"/>
+                <w:sz w:val="15"/>
+              </w:rPr>
+              <w:t xml:space="preserve">    "app will train a Decision Tree model on it and show you a full report."</w:t>
+            </w:r>
+          </w:p>
+          <w:p>
+            <w:pPr>
+              <w:spacing w:after="0" w:before="0"/>
+            </w:pPr>
+            <w:r>
+              <w:rPr>
+                <w:rFonts w:ascii="Consolas" w:hAnsi="Consolas"/>
+                <w:sz w:val="15"/>
+              </w:rPr>
+              <w:t>)</w:t>
+            </w:r>
+          </w:p>
+          <w:p>
+            <w:pPr>
+              <w:spacing w:after="0" w:before="0"/>
+            </w:pPr>
+            <w:r>
+              <w:rPr>
+                <w:rFonts w:ascii="Consolas" w:hAnsi="Consolas"/>
+                <w:sz w:val="15"/>
+              </w:rPr>
+              <w:t xml:space="preserve"> </w:t>
+            </w:r>
+          </w:p>
+          <w:p>
+            <w:pPr>
+              <w:spacing w:after="0" w:before="0"/>
+            </w:pPr>
+            <w:r>
+              <w:rPr>
+                <w:rFonts w:ascii="Consolas" w:hAnsi="Consolas"/>
+                <w:sz w:val="15"/>
+              </w:rPr>
+              <w:t># -----------------------------------------------------------------</w:t>
+            </w:r>
+          </w:p>
+          <w:p>
+            <w:pPr>
+              <w:spacing w:after="0" w:before="0"/>
+            </w:pPr>
+            <w:r>
+              <w:rPr>
+                <w:rFonts w:ascii="Consolas" w:hAnsi="Consolas"/>
+                <w:sz w:val="15"/>
+              </w:rPr>
+              <w:t># STEP 1: Upload the dataset</w:t>
+            </w:r>
+          </w:p>
+          <w:p>
+            <w:pPr>
+              <w:spacing w:after="0" w:before="0"/>
+            </w:pPr>
+            <w:r>
+              <w:rPr>
+                <w:rFonts w:ascii="Consolas" w:hAnsi="Consolas"/>
+                <w:sz w:val="15"/>
+              </w:rPr>
+              <w:t># -----------------------------------------------------------------</w:t>
+            </w:r>
+          </w:p>
+          <w:p>
+            <w:pPr>
+              <w:spacing w:after="0" w:before="0"/>
+            </w:pPr>
+            <w:r>
+              <w:rPr>
+                <w:rFonts w:ascii="Consolas" w:hAnsi="Consolas"/>
+                <w:sz w:val="15"/>
+              </w:rPr>
+              <w:t>uploaded_file = st.file_uploader("Upload your dataset (.csv file)", type=["csv"])</w:t>
+            </w:r>
+          </w:p>
+          <w:p>
+            <w:pPr>
+              <w:spacing w:after="0" w:before="0"/>
+            </w:pPr>
+            <w:r>
+              <w:rPr>
+                <w:rFonts w:ascii="Consolas" w:hAnsi="Consolas"/>
+                <w:sz w:val="15"/>
+              </w:rPr>
+              <w:t xml:space="preserve"> </w:t>
+            </w:r>
+          </w:p>
+          <w:p>
+            <w:pPr>
+              <w:spacing w:after="0" w:before="0"/>
+            </w:pPr>
+            <w:r>
+              <w:rPr>
+                <w:rFonts w:ascii="Consolas" w:hAnsi="Consolas"/>
+                <w:sz w:val="15"/>
+              </w:rPr>
+              <w:t># Everything below only runs once a file has been uploaded</w:t>
+            </w:r>
+          </w:p>
+          <w:p>
+            <w:pPr>
+              <w:spacing w:after="0" w:before="0"/>
+            </w:pPr>
+            <w:r>
+              <w:rPr>
+                <w:rFonts w:ascii="Consolas" w:hAnsi="Consolas"/>
+                <w:sz w:val="15"/>
+              </w:rPr>
+              <w:t>if uploaded_file is not None:</w:t>
+            </w:r>
+          </w:p>
+          <w:p>
+            <w:pPr>
+              <w:spacing w:after="0" w:before="0"/>
+            </w:pPr>
+            <w:r>
+              <w:rPr>
+                <w:rFonts w:ascii="Consolas" w:hAnsi="Consolas"/>
+                <w:sz w:val="15"/>
+              </w:rPr>
+              <w:t xml:space="preserve"> </w:t>
+            </w:r>
+          </w:p>
+          <w:p>
+            <w:pPr>
+              <w:spacing w:after="0" w:before="0"/>
+            </w:pPr>
+            <w:r>
+              <w:rPr>
+                <w:rFonts w:ascii="Consolas" w:hAnsi="Consolas"/>
+                <w:sz w:val="15"/>
+              </w:rPr>
+              <w:t xml:space="preserve">    # Read the uploaded CSV into a table (DataFrame)</w:t>
+            </w:r>
+          </w:p>
+          <w:p>
+            <w:pPr>
+              <w:spacing w:after="0" w:before="0"/>
+            </w:pPr>
+            <w:r>
+              <w:rPr>
+                <w:rFonts w:ascii="Consolas" w:hAnsi="Consolas"/>
+                <w:sz w:val="15"/>
+              </w:rPr>
+              <w:t xml:space="preserve">    df = pd.read_csv(uploaded_file)</w:t>
+            </w:r>
+          </w:p>
+          <w:p>
+            <w:pPr>
+              <w:spacing w:after="0" w:before="0"/>
+            </w:pPr>
+            <w:r>
+              <w:rPr>
+                <w:rFonts w:ascii="Consolas" w:hAnsi="Consolas"/>
+                <w:sz w:val="15"/>
+              </w:rPr>
+              <w:t xml:space="preserve"> </w:t>
+            </w:r>
+          </w:p>
+          <w:p>
+            <w:pPr>
+              <w:spacing w:after="0" w:before="0"/>
+            </w:pPr>
+            <w:r>
+              <w:rPr>
+                <w:rFonts w:ascii="Consolas" w:hAnsi="Consolas"/>
+                <w:sz w:val="15"/>
+              </w:rPr>
+              <w:t xml:space="preserve">    st.subheader("1. Preview of Your Dataset")</w:t>
+            </w:r>
+          </w:p>
+          <w:p>
+            <w:pPr>
+              <w:spacing w:after="0" w:before="0"/>
+            </w:pPr>
+            <w:r>
+              <w:rPr>
+                <w:rFonts w:ascii="Consolas" w:hAnsi="Consolas"/>
+                <w:sz w:val="15"/>
+              </w:rPr>
+              <w:t xml:space="preserve">    st.write(f"Rows: {df.shape[0]}, Columns: {df.shape[1]}")</w:t>
+            </w:r>
+          </w:p>
+          <w:p>
+            <w:pPr>
+              <w:spacing w:after="0" w:before="0"/>
+            </w:pPr>
+            <w:r>
+              <w:rPr>
+                <w:rFonts w:ascii="Consolas" w:hAnsi="Consolas"/>
+                <w:sz w:val="15"/>
+              </w:rPr>
+              <w:t xml:space="preserve">    st.dataframe(df.head(10))</w:t>
+            </w:r>
+          </w:p>
+          <w:p>
+            <w:pPr>
+              <w:spacing w:after="0" w:before="0"/>
+            </w:pPr>
+            <w:r>
+              <w:rPr>
+                <w:rFonts w:ascii="Consolas" w:hAnsi="Consolas"/>
+                <w:sz w:val="15"/>
+              </w:rPr>
+              <w:t xml:space="preserve"> </w:t>
+            </w:r>
+          </w:p>
+          <w:p>
+            <w:pPr>
+              <w:spacing w:after="0" w:before="0"/>
+            </w:pPr>
+            <w:r>
+              <w:rPr>
+                <w:rFonts w:ascii="Consolas" w:hAnsi="Consolas"/>
+                <w:sz w:val="15"/>
+              </w:rPr>
+              <w:t xml:space="preserve">    # Drop rows that have missing values, to keep things simple</w:t>
+            </w:r>
+          </w:p>
+          <w:p>
+            <w:pPr>
+              <w:spacing w:after="0" w:before="0"/>
+            </w:pPr>
+            <w:r>
+              <w:rPr>
+                <w:rFonts w:ascii="Consolas" w:hAnsi="Consolas"/>
+                <w:sz w:val="15"/>
+              </w:rPr>
+              <w:t xml:space="preserve">    df = df.dropna()</w:t>
+            </w:r>
+          </w:p>
+          <w:p>
+            <w:pPr>
+              <w:spacing w:after="0" w:before="0"/>
+            </w:pPr>
+            <w:r>
+              <w:rPr>
+                <w:rFonts w:ascii="Consolas" w:hAnsi="Consolas"/>
+                <w:sz w:val="15"/>
+              </w:rPr>
+              <w:t xml:space="preserve"> </w:t>
+            </w:r>
+          </w:p>
+          <w:p>
+            <w:pPr>
+              <w:spacing w:after="0" w:before="0"/>
+            </w:pPr>
+            <w:r>
+              <w:rPr>
+                <w:rFonts w:ascii="Consolas" w:hAnsi="Consolas"/>
+                <w:sz w:val="15"/>
+              </w:rPr>
+              <w:t xml:space="preserve">    # -----------------------------------------------------------------</w:t>
+            </w:r>
+          </w:p>
+          <w:p>
+            <w:pPr>
+              <w:spacing w:after="0" w:before="0"/>
+            </w:pPr>
+            <w:r>
+              <w:rPr>
+                <w:rFonts w:ascii="Consolas" w:hAnsi="Consolas"/>
+                <w:sz w:val="15"/>
+              </w:rPr>
+              <w:t xml:space="preserve">    # STEP 2: Let the user choose the target column and feature columns</w:t>
+            </w:r>
+          </w:p>
+          <w:p>
+            <w:pPr>
+              <w:spacing w:after="0" w:before="0"/>
+            </w:pPr>
+            <w:r>
+              <w:rPr>
+                <w:rFonts w:ascii="Consolas" w:hAnsi="Consolas"/>
+                <w:sz w:val="15"/>
+              </w:rPr>
+              <w:t xml:space="preserve">    # -----------------------------------------------------------------</w:t>
+            </w:r>
+          </w:p>
+          <w:p>
+            <w:pPr>
+              <w:spacing w:after="0" w:before="0"/>
+            </w:pPr>
+            <w:r>
+              <w:rPr>
+                <w:rFonts w:ascii="Consolas" w:hAnsi="Consolas"/>
+                <w:sz w:val="15"/>
+              </w:rPr>
+              <w:t xml:space="preserve">    st.subheader("2. Choose Target and Feature Columns")</w:t>
+            </w:r>
+          </w:p>
+          <w:p>
+            <w:pPr>
+              <w:spacing w:after="0" w:before="0"/>
+            </w:pPr>
+            <w:r>
+              <w:rPr>
+                <w:rFonts w:ascii="Consolas" w:hAnsi="Consolas"/>
+                <w:sz w:val="15"/>
+              </w:rPr>
+              <w:t xml:space="preserve"> </w:t>
+            </w:r>
+          </w:p>
+          <w:p>
+            <w:pPr>
+              <w:spacing w:after="0" w:before="0"/>
+            </w:pPr>
+            <w:r>
+              <w:rPr>
+                <w:rFonts w:ascii="Consolas" w:hAnsi="Consolas"/>
+                <w:sz w:val="15"/>
+              </w:rPr>
+              <w:t xml:space="preserve">    all_columns = list(df.columns)</w:t>
+            </w:r>
+          </w:p>
+          <w:p>
+            <w:pPr>
+              <w:spacing w:after="0" w:before="0"/>
+            </w:pPr>
+            <w:r>
+              <w:rPr>
+                <w:rFonts w:ascii="Consolas" w:hAnsi="Consolas"/>
+                <w:sz w:val="15"/>
+              </w:rPr>
+              <w:t xml:space="preserve">    target_column = st.selectbox(</w:t>
+            </w:r>
+          </w:p>
+          <w:p>
+            <w:pPr>
+              <w:spacing w:after="0" w:before="0"/>
+            </w:pPr>
+            <w:r>
+              <w:rPr>
+                <w:rFonts w:ascii="Consolas" w:hAnsi="Consolas"/>
+                <w:sz w:val="15"/>
+              </w:rPr>
+              <w:t xml:space="preserve">        "Which column do you want to PREDICT (target)?",</w:t>
+            </w:r>
+          </w:p>
+          <w:p>
+            <w:pPr>
+              <w:spacing w:after="0" w:before="0"/>
+            </w:pPr>
+            <w:r>
+              <w:rPr>
+                <w:rFonts w:ascii="Consolas" w:hAnsi="Consolas"/>
+                <w:sz w:val="15"/>
+              </w:rPr>
+              <w:t xml:space="preserve">        options=all_columns,</w:t>
+            </w:r>
+          </w:p>
+          <w:p>
+            <w:pPr>
+              <w:spacing w:after="0" w:before="0"/>
+            </w:pPr>
+            <w:r>
+              <w:rPr>
+                <w:rFonts w:ascii="Consolas" w:hAnsi="Consolas"/>
+                <w:sz w:val="15"/>
+              </w:rPr>
+              <w:t xml:space="preserve">        index=len(all_columns) - 1,  # default: last column</w:t>
+            </w:r>
+          </w:p>
+          <w:p>
+            <w:pPr>
+              <w:spacing w:after="0" w:before="0"/>
+            </w:pPr>
+            <w:r>
+              <w:rPr>
+                <w:rFonts w:ascii="Consolas" w:hAnsi="Consolas"/>
+                <w:sz w:val="15"/>
+              </w:rPr>
+              <w:t xml:space="preserve">    )</w:t>
+            </w:r>
+          </w:p>
+          <w:p>
+            <w:pPr>
+              <w:spacing w:after="0" w:before="0"/>
+            </w:pPr>
+            <w:r>
+              <w:rPr>
+                <w:rFonts w:ascii="Consolas" w:hAnsi="Consolas"/>
+                <w:sz w:val="15"/>
+              </w:rPr>
+              <w:t xml:space="preserve"> </w:t>
+            </w:r>
+          </w:p>
+          <w:p>
+            <w:pPr>
+              <w:spacing w:after="0" w:before="0"/>
+            </w:pPr>
+            <w:r>
+              <w:rPr>
+                <w:rFonts w:ascii="Consolas" w:hAnsi="Consolas"/>
+                <w:sz w:val="15"/>
+              </w:rPr>
+              <w:t xml:space="preserve">    feature_options = [col for col in all_columns if col != target_column]</w:t>
+            </w:r>
+          </w:p>
+          <w:p>
+            <w:pPr>
+              <w:spacing w:after="0" w:before="0"/>
+            </w:pPr>
+            <w:r>
+              <w:rPr>
+                <w:rFonts w:ascii="Consolas" w:hAnsi="Consolas"/>
+                <w:sz w:val="15"/>
+              </w:rPr>
+              <w:t xml:space="preserve">    feature_columns = st.multiselect(</w:t>
+            </w:r>
+          </w:p>
+          <w:p>
+            <w:pPr>
+              <w:spacing w:after="0" w:before="0"/>
+            </w:pPr>
+            <w:r>
+              <w:rPr>
+                <w:rFonts w:ascii="Consolas" w:hAnsi="Consolas"/>
+                <w:sz w:val="15"/>
+              </w:rPr>
+              <w:t xml:space="preserve">        "Which columns should be used as FEATURES (inputs)?",</w:t>
+            </w:r>
+          </w:p>
+          <w:p>
+            <w:pPr>
+              <w:spacing w:after="0" w:before="0"/>
+            </w:pPr>
+            <w:r>
+              <w:rPr>
+                <w:rFonts w:ascii="Consolas" w:hAnsi="Consolas"/>
+                <w:sz w:val="15"/>
+              </w:rPr>
+              <w:t xml:space="preserve">        options=feature_options,</w:t>
+            </w:r>
+          </w:p>
+          <w:p>
+            <w:pPr>
+              <w:spacing w:after="0" w:before="0"/>
+            </w:pPr>
+            <w:r>
+              <w:rPr>
+                <w:rFonts w:ascii="Consolas" w:hAnsi="Consolas"/>
+                <w:sz w:val="15"/>
+              </w:rPr>
+              <w:t xml:space="preserve">        default=feature_options,</w:t>
+            </w:r>
+          </w:p>
+          <w:p>
+            <w:pPr>
+              <w:spacing w:after="0" w:before="0"/>
+            </w:pPr>
+            <w:r>
+              <w:rPr>
+                <w:rFonts w:ascii="Consolas" w:hAnsi="Consolas"/>
+                <w:sz w:val="15"/>
+              </w:rPr>
+              <w:t xml:space="preserve">    )</w:t>
+            </w:r>
+          </w:p>
+          <w:p>
+            <w:pPr>
+              <w:spacing w:after="0" w:before="0"/>
+            </w:pPr>
+            <w:r>
+              <w:rPr>
+                <w:rFonts w:ascii="Consolas" w:hAnsi="Consolas"/>
+                <w:sz w:val="15"/>
+              </w:rPr>
+              <w:t xml:space="preserve"> </w:t>
+            </w:r>
+          </w:p>
+          <w:p>
+            <w:pPr>
+              <w:spacing w:after="0" w:before="0"/>
+            </w:pPr>
+            <w:r>
+              <w:rPr>
+                <w:rFonts w:ascii="Consolas" w:hAnsi="Consolas"/>
+                <w:sz w:val="15"/>
+              </w:rPr>
+              <w:t xml:space="preserve">    max_depth = st.slider(</w:t>
+            </w:r>
+          </w:p>
+          <w:p>
+            <w:pPr>
+              <w:spacing w:after="0" w:before="0"/>
+            </w:pPr>
+            <w:r>
+              <w:rPr>
+                <w:rFonts w:ascii="Consolas" w:hAnsi="Consolas"/>
+                <w:sz w:val="15"/>
+              </w:rPr>
+              <w:t xml:space="preserve">        "Decision Tree depth (smaller = simpler tree, larger = more accurate but more complex)",</w:t>
+            </w:r>
+          </w:p>
+          <w:p>
+            <w:pPr>
+              <w:spacing w:after="0" w:before="0"/>
+            </w:pPr>
+            <w:r>
+              <w:rPr>
+                <w:rFonts w:ascii="Consolas" w:hAnsi="Consolas"/>
+                <w:sz w:val="15"/>
+              </w:rPr>
+              <w:t xml:space="preserve">        min_value=2, max_value=10, value=4,</w:t>
+            </w:r>
+          </w:p>
+          <w:p>
+            <w:pPr>
+              <w:spacing w:after="0" w:before="0"/>
+            </w:pPr>
+            <w:r>
+              <w:rPr>
+                <w:rFonts w:ascii="Consolas" w:hAnsi="Consolas"/>
+                <w:sz w:val="15"/>
+              </w:rPr>
+              <w:t xml:space="preserve">    )</w:t>
+            </w:r>
+          </w:p>
+          <w:p>
+            <w:pPr>
+              <w:spacing w:after="0" w:before="0"/>
+            </w:pPr>
+            <w:r>
+              <w:rPr>
+                <w:rFonts w:ascii="Consolas" w:hAnsi="Consolas"/>
+                <w:sz w:val="15"/>
+              </w:rPr>
+              <w:t xml:space="preserve"> </w:t>
+            </w:r>
+          </w:p>
+          <w:p>
+            <w:pPr>
+              <w:spacing w:after="0" w:before="0"/>
+            </w:pPr>
+            <w:r>
+              <w:rPr>
+                <w:rFonts w:ascii="Consolas" w:hAnsi="Consolas"/>
+                <w:sz w:val="15"/>
+              </w:rPr>
+              <w:t xml:space="preserve">    train_button = st.button("Train Decision Tree Model")</w:t>
+            </w:r>
+          </w:p>
+          <w:p>
+            <w:pPr>
+              <w:spacing w:after="0" w:before="0"/>
+            </w:pPr>
+            <w:r>
+              <w:rPr>
+                <w:rFonts w:ascii="Consolas" w:hAnsi="Consolas"/>
+                <w:sz w:val="15"/>
+              </w:rPr>
+              <w:t xml:space="preserve"> </w:t>
+            </w:r>
+          </w:p>
+          <w:p>
+            <w:pPr>
+              <w:spacing w:after="0" w:before="0"/>
+            </w:pPr>
+            <w:r>
+              <w:rPr>
+                <w:rFonts w:ascii="Consolas" w:hAnsi="Consolas"/>
+                <w:sz w:val="15"/>
+              </w:rPr>
+              <w:t xml:space="preserve">    if train_button and len(feature_columns) &gt; 0:</w:t>
+            </w:r>
+          </w:p>
+          <w:p>
+            <w:pPr>
+              <w:spacing w:after="0" w:before="0"/>
+            </w:pPr>
+            <w:r>
+              <w:rPr>
+                <w:rFonts w:ascii="Consolas" w:hAnsi="Consolas"/>
+                <w:sz w:val="15"/>
+              </w:rPr>
+              <w:t xml:space="preserve"> </w:t>
+            </w:r>
+          </w:p>
+          <w:p>
+            <w:pPr>
+              <w:spacing w:after="0" w:before="0"/>
+            </w:pPr>
+            <w:r>
+              <w:rPr>
+                <w:rFonts w:ascii="Consolas" w:hAnsi="Consolas"/>
+                <w:sz w:val="15"/>
+              </w:rPr>
+              <w:t xml:space="preserve">        # -----------------------------------------------------------------</w:t>
+            </w:r>
+          </w:p>
+          <w:p>
+            <w:pPr>
+              <w:spacing w:after="0" w:before="0"/>
+            </w:pPr>
+            <w:r>
+              <w:rPr>
+                <w:rFonts w:ascii="Consolas" w:hAnsi="Consolas"/>
+                <w:sz w:val="15"/>
+              </w:rPr>
+              <w:t xml:space="preserve">        # STEP 3: Prepare the data (X = features, y = target)</w:t>
+            </w:r>
+          </w:p>
+          <w:p>
+            <w:pPr>
+              <w:spacing w:after="0" w:before="0"/>
+            </w:pPr>
+            <w:r>
+              <w:rPr>
+                <w:rFonts w:ascii="Consolas" w:hAnsi="Consolas"/>
+                <w:sz w:val="15"/>
+              </w:rPr>
+              <w:t xml:space="preserve">        # -----------------------------------------------------------------</w:t>
+            </w:r>
+          </w:p>
+          <w:p>
+            <w:pPr>
+              <w:spacing w:after="0" w:before="0"/>
+            </w:pPr>
+            <w:r>
+              <w:rPr>
+                <w:rFonts w:ascii="Consolas" w:hAnsi="Consolas"/>
+                <w:sz w:val="15"/>
+              </w:rPr>
+              <w:t xml:space="preserve">        X = df[feature_columns].copy()</w:t>
+            </w:r>
+          </w:p>
+          <w:p>
+            <w:pPr>
+              <w:spacing w:after="0" w:before="0"/>
+            </w:pPr>
+            <w:r>
+              <w:rPr>
+                <w:rFonts w:ascii="Consolas" w:hAnsi="Consolas"/>
+                <w:sz w:val="15"/>
+              </w:rPr>
+              <w:t xml:space="preserve">        y = df[target_column].copy()</w:t>
+            </w:r>
+          </w:p>
+          <w:p>
+            <w:pPr>
+              <w:spacing w:after="0" w:before="0"/>
+            </w:pPr>
+            <w:r>
+              <w:rPr>
+                <w:rFonts w:ascii="Consolas" w:hAnsi="Consolas"/>
+                <w:sz w:val="15"/>
+              </w:rPr>
+              <w:t xml:space="preserve"> </w:t>
+            </w:r>
+          </w:p>
+          <w:p>
+            <w:pPr>
+              <w:spacing w:after="0" w:before="0"/>
+            </w:pPr>
+            <w:r>
+              <w:rPr>
+                <w:rFonts w:ascii="Consolas" w:hAnsi="Consolas"/>
+                <w:sz w:val="15"/>
+              </w:rPr>
+              <w:t xml:space="preserve">        # Machine learning models only understand numbers. If a feature column</w:t>
+            </w:r>
+          </w:p>
+          <w:p>
+            <w:pPr>
+              <w:spacing w:after="0" w:before="0"/>
+            </w:pPr>
+            <w:r>
+              <w:rPr>
+                <w:rFonts w:ascii="Consolas" w:hAnsi="Consolas"/>
+                <w:sz w:val="15"/>
+              </w:rPr>
+              <w:t xml:space="preserve">        # contains text (e.g. "Male"/"Female", "Poor"/"Good"), convert it to</w:t>
+            </w:r>
+          </w:p>
+          <w:p>
+            <w:pPr>
+              <w:spacing w:after="0" w:before="0"/>
+            </w:pPr>
+            <w:r>
+              <w:rPr>
+                <w:rFonts w:ascii="Consolas" w:hAnsi="Consolas"/>
+                <w:sz w:val="15"/>
+              </w:rPr>
+              <w:t xml:space="preserve">        # numbers using LabelEncoder. We check "is this column NOT numeric"</w:t>
+            </w:r>
+          </w:p>
+          <w:p>
+            <w:pPr>
+              <w:spacing w:after="0" w:before="0"/>
+            </w:pPr>
+            <w:r>
+              <w:rPr>
+                <w:rFonts w:ascii="Consolas" w:hAnsi="Consolas"/>
+                <w:sz w:val="15"/>
+              </w:rPr>
+              <w:t xml:space="preserve">        # instead of checking for a specific text dtype name, because</w:t>
+            </w:r>
+          </w:p>
+          <w:p>
+            <w:pPr>
+              <w:spacing w:after="0" w:before="0"/>
+            </w:pPr>
+            <w:r>
+              <w:rPr>
+                <w:rFonts w:ascii="Consolas" w:hAnsi="Consolas"/>
+                <w:sz w:val="15"/>
+              </w:rPr>
+              <w:t xml:space="preserve">        # different pandas versions label text columns differently</w:t>
+            </w:r>
+          </w:p>
+          <w:p>
+            <w:pPr>
+              <w:spacing w:after="0" w:before="0"/>
+            </w:pPr>
+            <w:r>
+              <w:rPr>
+                <w:rFonts w:ascii="Consolas" w:hAnsi="Consolas"/>
+                <w:sz w:val="15"/>
+              </w:rPr>
+              <w:t xml:space="preserve">        # (e.g. "object" or "str") - this way it catches text columns either way.</w:t>
+            </w:r>
+          </w:p>
+          <w:p>
+            <w:pPr>
+              <w:spacing w:after="0" w:before="0"/>
+            </w:pPr>
+            <w:r>
+              <w:rPr>
+                <w:rFonts w:ascii="Consolas" w:hAnsi="Consolas"/>
+                <w:sz w:val="15"/>
+              </w:rPr>
+              <w:t xml:space="preserve">        for col in X.columns:</w:t>
+            </w:r>
+          </w:p>
+          <w:p>
+            <w:pPr>
+              <w:spacing w:after="0" w:before="0"/>
+            </w:pPr>
+            <w:r>
+              <w:rPr>
+                <w:rFonts w:ascii="Consolas" w:hAnsi="Consolas"/>
+                <w:sz w:val="15"/>
+              </w:rPr>
+              <w:t xml:space="preserve">            if not pd.api.types.is_numeric_dtype(X[col]):</w:t>
+            </w:r>
+          </w:p>
+          <w:p>
+            <w:pPr>
+              <w:spacing w:after="0" w:before="0"/>
+            </w:pPr>
+            <w:r>
+              <w:rPr>
+                <w:rFonts w:ascii="Consolas" w:hAnsi="Consolas"/>
+                <w:sz w:val="15"/>
+              </w:rPr>
+              <w:t xml:space="preserve">                X[col] = LabelEncoder().fit_transform(X[col].astype(str))</w:t>
+            </w:r>
+          </w:p>
+          <w:p>
+            <w:pPr>
+              <w:spacing w:after="0" w:before="0"/>
+            </w:pPr>
+            <w:r>
+              <w:rPr>
+                <w:rFonts w:ascii="Consolas" w:hAnsi="Consolas"/>
+                <w:sz w:val="15"/>
+              </w:rPr>
+              <w:t xml:space="preserve"> </w:t>
+            </w:r>
+          </w:p>
+          <w:p>
+            <w:pPr>
+              <w:spacing w:after="0" w:before="0"/>
+            </w:pPr>
+            <w:r>
+              <w:rPr>
+                <w:rFonts w:ascii="Consolas" w:hAnsi="Consolas"/>
+                <w:sz w:val="15"/>
+              </w:rPr>
+              <w:t xml:space="preserve">        # If the target column is text (e.g. "Yes"/"No", "Low"/"Medium"/"High"),</w:t>
+            </w:r>
+          </w:p>
+          <w:p>
+            <w:pPr>
+              <w:spacing w:after="0" w:before="0"/>
+            </w:pPr>
+            <w:r>
+              <w:rPr>
+                <w:rFonts w:ascii="Consolas" w:hAnsi="Consolas"/>
+                <w:sz w:val="15"/>
+              </w:rPr>
+              <w:t xml:space="preserve">        # convert it to numbers too, and remember the original labels so we can</w:t>
+            </w:r>
+          </w:p>
+          <w:p>
+            <w:pPr>
+              <w:spacing w:after="0" w:before="0"/>
+            </w:pPr>
+            <w:r>
+              <w:rPr>
+                <w:rFonts w:ascii="Consolas" w:hAnsi="Consolas"/>
+                <w:sz w:val="15"/>
+              </w:rPr>
+              <w:t xml:space="preserve">        # show readable names later.</w:t>
+            </w:r>
+          </w:p>
+          <w:p>
+            <w:pPr>
+              <w:spacing w:after="0" w:before="0"/>
+            </w:pPr>
+            <w:r>
+              <w:rPr>
+                <w:rFonts w:ascii="Consolas" w:hAnsi="Consolas"/>
+                <w:sz w:val="15"/>
+              </w:rPr>
+              <w:t xml:space="preserve">        target_encoder = None</w:t>
+            </w:r>
+          </w:p>
+          <w:p>
+            <w:pPr>
+              <w:spacing w:after="0" w:before="0"/>
+            </w:pPr>
+            <w:r>
+              <w:rPr>
+                <w:rFonts w:ascii="Consolas" w:hAnsi="Consolas"/>
+                <w:sz w:val="15"/>
+              </w:rPr>
+              <w:t xml:space="preserve">        if not pd.api.types.is_numeric_dtype(y):</w:t>
+            </w:r>
+          </w:p>
+          <w:p>
+            <w:pPr>
+              <w:spacing w:after="0" w:before="0"/>
+            </w:pPr>
+            <w:r>
+              <w:rPr>
+                <w:rFonts w:ascii="Consolas" w:hAnsi="Consolas"/>
+                <w:sz w:val="15"/>
+              </w:rPr>
+              <w:t xml:space="preserve">            target_encoder = LabelEncoder()</w:t>
+            </w:r>
+          </w:p>
+          <w:p>
+            <w:pPr>
+              <w:spacing w:after="0" w:before="0"/>
+            </w:pPr>
+            <w:r>
+              <w:rPr>
+                <w:rFonts w:ascii="Consolas" w:hAnsi="Consolas"/>
+                <w:sz w:val="15"/>
+              </w:rPr>
+              <w:t xml:space="preserve">            y = target_encoder.fit_transform(y.astype(str))</w:t>
+            </w:r>
+          </w:p>
+          <w:p>
+            <w:pPr>
+              <w:spacing w:after="0" w:before="0"/>
+            </w:pPr>
+            <w:r>
+              <w:rPr>
+                <w:rFonts w:ascii="Consolas" w:hAnsi="Consolas"/>
+                <w:sz w:val="15"/>
+              </w:rPr>
+              <w:t xml:space="preserve">            class_names = [str(c) for c in target_encoder.classes_]</w:t>
+            </w:r>
+          </w:p>
+          <w:p>
+            <w:pPr>
+              <w:spacing w:after="0" w:before="0"/>
+            </w:pPr>
+            <w:r>
+              <w:rPr>
+                <w:rFonts w:ascii="Consolas" w:hAnsi="Consolas"/>
+                <w:sz w:val="15"/>
+              </w:rPr>
+              <w:t xml:space="preserve">        else:</w:t>
+            </w:r>
+          </w:p>
+          <w:p>
+            <w:pPr>
+              <w:spacing w:after="0" w:before="0"/>
+            </w:pPr>
+            <w:r>
+              <w:rPr>
+                <w:rFonts w:ascii="Consolas" w:hAnsi="Consolas"/>
+                <w:sz w:val="15"/>
+              </w:rPr>
+              <w:t xml:space="preserve">            class_names = [str(c) for c in sorted(y.unique())]</w:t>
+            </w:r>
+          </w:p>
+          <w:p>
+            <w:pPr>
+              <w:spacing w:after="0" w:before="0"/>
+            </w:pPr>
+            <w:r>
+              <w:rPr>
+                <w:rFonts w:ascii="Consolas" w:hAnsi="Consolas"/>
+                <w:sz w:val="15"/>
+              </w:rPr>
+              <w:t xml:space="preserve"> </w:t>
+            </w:r>
+          </w:p>
+          <w:p>
+            <w:pPr>
+              <w:spacing w:after="0" w:before="0"/>
+            </w:pPr>
+            <w:r>
+              <w:rPr>
+                <w:rFonts w:ascii="Consolas" w:hAnsi="Consolas"/>
+                <w:sz w:val="15"/>
+              </w:rPr>
+              <w:t xml:space="preserve">        # -----------------------------------------------------------------</w:t>
+            </w:r>
+          </w:p>
+          <w:p>
+            <w:pPr>
+              <w:spacing w:after="0" w:before="0"/>
+            </w:pPr>
+            <w:r>
+              <w:rPr>
+                <w:rFonts w:ascii="Consolas" w:hAnsi="Consolas"/>
+                <w:sz w:val="15"/>
+              </w:rPr>
+              <w:t xml:space="preserve">        # STEP 4: Split into training data and testing data</w:t>
+            </w:r>
+          </w:p>
+          <w:p>
+            <w:pPr>
+              <w:spacing w:after="0" w:before="0"/>
+            </w:pPr>
+            <w:r>
+              <w:rPr>
+                <w:rFonts w:ascii="Consolas" w:hAnsi="Consolas"/>
+                <w:sz w:val="15"/>
+              </w:rPr>
+              <w:t xml:space="preserve">        # -----------------------------------------------------------------</w:t>
+            </w:r>
+          </w:p>
+          <w:p>
+            <w:pPr>
+              <w:spacing w:after="0" w:before="0"/>
+            </w:pPr>
+            <w:r>
+              <w:rPr>
+                <w:rFonts w:ascii="Consolas" w:hAnsi="Consolas"/>
+                <w:sz w:val="15"/>
+              </w:rPr>
+              <w:t xml:space="preserve">        X_train, X_test, y_train, y_test = train_test_split(</w:t>
+            </w:r>
+          </w:p>
+          <w:p>
+            <w:pPr>
+              <w:spacing w:after="0" w:before="0"/>
+            </w:pPr>
+            <w:r>
+              <w:rPr>
+                <w:rFonts w:ascii="Consolas" w:hAnsi="Consolas"/>
+                <w:sz w:val="15"/>
+              </w:rPr>
+              <w:t xml:space="preserve">            X, y, test_size=0.2, random_state=42</w:t>
+            </w:r>
+          </w:p>
+          <w:p>
+            <w:pPr>
+              <w:spacing w:after="0" w:before="0"/>
+            </w:pPr>
+            <w:r>
+              <w:rPr>
+                <w:rFonts w:ascii="Consolas" w:hAnsi="Consolas"/>
+                <w:sz w:val="15"/>
+              </w:rPr>
+              <w:t xml:space="preserve">        )</w:t>
+            </w:r>
+          </w:p>
+          <w:p>
+            <w:pPr>
+              <w:spacing w:after="0" w:before="0"/>
+            </w:pPr>
+            <w:r>
+              <w:rPr>
+                <w:rFonts w:ascii="Consolas" w:hAnsi="Consolas"/>
+                <w:sz w:val="15"/>
+              </w:rPr>
+              <w:t xml:space="preserve"> </w:t>
+            </w:r>
+          </w:p>
+          <w:p>
+            <w:pPr>
+              <w:spacing w:after="0" w:before="0"/>
+            </w:pPr>
+            <w:r>
+              <w:rPr>
+                <w:rFonts w:ascii="Consolas" w:hAnsi="Consolas"/>
+                <w:sz w:val="15"/>
+              </w:rPr>
+              <w:t xml:space="preserve">        # -----------------------------------------------------------------</w:t>
+            </w:r>
+          </w:p>
+          <w:p>
+            <w:pPr>
+              <w:spacing w:after="0" w:before="0"/>
+            </w:pPr>
+            <w:r>
+              <w:rPr>
+                <w:rFonts w:ascii="Consolas" w:hAnsi="Consolas"/>
+                <w:sz w:val="15"/>
+              </w:rPr>
+              <w:t xml:space="preserve">        # STEP 5: Train the Decision Tree model</w:t>
+            </w:r>
+          </w:p>
+          <w:p>
+            <w:pPr>
+              <w:spacing w:after="0" w:before="0"/>
+            </w:pPr>
+            <w:r>
+              <w:rPr>
+                <w:rFonts w:ascii="Consolas" w:hAnsi="Consolas"/>
+                <w:sz w:val="15"/>
+              </w:rPr>
+              <w:t xml:space="preserve">        # -----------------------------------------------------------------</w:t>
+            </w:r>
+          </w:p>
+          <w:p>
+            <w:pPr>
+              <w:spacing w:after="0" w:before="0"/>
+            </w:pPr>
+            <w:r>
+              <w:rPr>
+                <w:rFonts w:ascii="Consolas" w:hAnsi="Consolas"/>
+                <w:sz w:val="15"/>
+              </w:rPr>
+              <w:t xml:space="preserve">        model = DecisionTreeClassifier(max_depth=max_depth, random_state=42)</w:t>
+            </w:r>
+          </w:p>
+          <w:p>
+            <w:pPr>
+              <w:spacing w:after="0" w:before="0"/>
+            </w:pPr>
+            <w:r>
+              <w:rPr>
+                <w:rFonts w:ascii="Consolas" w:hAnsi="Consolas"/>
+                <w:sz w:val="15"/>
+              </w:rPr>
+              <w:t xml:space="preserve">        model.fit(X_train, y_train)</w:t>
+            </w:r>
+          </w:p>
+          <w:p>
+            <w:pPr>
+              <w:spacing w:after="0" w:before="0"/>
+            </w:pPr>
+            <w:r>
+              <w:rPr>
+                <w:rFonts w:ascii="Consolas" w:hAnsi="Consolas"/>
+                <w:sz w:val="15"/>
+              </w:rPr>
+              <w:t xml:space="preserve"> </w:t>
+            </w:r>
+          </w:p>
+          <w:p>
+            <w:pPr>
+              <w:spacing w:after="0" w:before="0"/>
+            </w:pPr>
+            <w:r>
+              <w:rPr>
+                <w:rFonts w:ascii="Consolas" w:hAnsi="Consolas"/>
+                <w:sz w:val="15"/>
+              </w:rPr>
+              <w:t xml:space="preserve">        # -----------------------------------------------------------------</w:t>
+            </w:r>
+          </w:p>
+          <w:p>
+            <w:pPr>
+              <w:spacing w:after="0" w:before="0"/>
+            </w:pPr>
+            <w:r>
+              <w:rPr>
+                <w:rFonts w:ascii="Consolas" w:hAnsi="Consolas"/>
+                <w:sz w:val="15"/>
+              </w:rPr>
+              <w:t xml:space="preserve">        # STEP 6: Test the model and build the report</w:t>
+            </w:r>
+          </w:p>
+          <w:p>
+            <w:pPr>
+              <w:spacing w:after="0" w:before="0"/>
+            </w:pPr>
+            <w:r>
+              <w:rPr>
+                <w:rFonts w:ascii="Consolas" w:hAnsi="Consolas"/>
+                <w:sz w:val="15"/>
+              </w:rPr>
+              <w:t xml:space="preserve">        # -----------------------------------------------------------------</w:t>
+            </w:r>
+          </w:p>
+          <w:p>
+            <w:pPr>
+              <w:spacing w:after="0" w:before="0"/>
+            </w:pPr>
+            <w:r>
+              <w:rPr>
+                <w:rFonts w:ascii="Consolas" w:hAnsi="Consolas"/>
+                <w:sz w:val="15"/>
+              </w:rPr>
+              <w:t xml:space="preserve">        y_pred = model.predict(X_test)</w:t>
+            </w:r>
+          </w:p>
+          <w:p>
+            <w:pPr>
+              <w:spacing w:after="0" w:before="0"/>
+            </w:pPr>
+            <w:r>
+              <w:rPr>
+                <w:rFonts w:ascii="Consolas" w:hAnsi="Consolas"/>
+                <w:sz w:val="15"/>
+              </w:rPr>
+              <w:t xml:space="preserve">        test_accuracy = accuracy_score(y_test, y_pred)</w:t>
+            </w:r>
+          </w:p>
+          <w:p>
+            <w:pPr>
+              <w:spacing w:after="0" w:before="0"/>
+            </w:pPr>
+            <w:r>
+              <w:rPr>
+                <w:rFonts w:ascii="Consolas" w:hAnsi="Consolas"/>
+                <w:sz w:val="15"/>
+              </w:rPr>
+              <w:t xml:space="preserve"> </w:t>
+            </w:r>
+          </w:p>
+          <w:p>
+            <w:pPr>
+              <w:spacing w:after="0" w:before="0"/>
+            </w:pPr>
+            <w:r>
+              <w:rPr>
+                <w:rFonts w:ascii="Consolas" w:hAnsi="Consolas"/>
+                <w:sz w:val="15"/>
+              </w:rPr>
+              <w:t xml:space="preserve">        st.subheader("3. Model Report")</w:t>
+            </w:r>
+          </w:p>
+          <w:p>
+            <w:pPr>
+              <w:spacing w:after="0" w:before="0"/>
+            </w:pPr>
+            <w:r>
+              <w:rPr>
+                <w:rFonts w:ascii="Consolas" w:hAnsi="Consolas"/>
+                <w:sz w:val="15"/>
+              </w:rPr>
+              <w:t xml:space="preserve">        st.metric("Test Accuracy", f"{test_accuracy * 100:.2f}%")</w:t>
+            </w:r>
+          </w:p>
+          <w:p>
+            <w:pPr>
+              <w:spacing w:after="0" w:before="0"/>
+            </w:pPr>
+            <w:r>
+              <w:rPr>
+                <w:rFonts w:ascii="Consolas" w:hAnsi="Consolas"/>
+                <w:sz w:val="15"/>
+              </w:rPr>
+              <w:t xml:space="preserve"> </w:t>
+            </w:r>
+          </w:p>
+          <w:p>
+            <w:pPr>
+              <w:spacing w:after="0" w:before="0"/>
+            </w:pPr>
+            <w:r>
+              <w:rPr>
+                <w:rFonts w:ascii="Consolas" w:hAnsi="Consolas"/>
+                <w:sz w:val="15"/>
+              </w:rPr>
+              <w:t xml:space="preserve">        st.write("**Classification Report** (precision, recall, f1-score per class):")</w:t>
+            </w:r>
+          </w:p>
+          <w:p>
+            <w:pPr>
+              <w:spacing w:after="0" w:before="0"/>
+            </w:pPr>
+            <w:r>
+              <w:rPr>
+                <w:rFonts w:ascii="Consolas" w:hAnsi="Consolas"/>
+                <w:sz w:val="15"/>
+              </w:rPr>
+              <w:t xml:space="preserve">        report_dict = classification_report(</w:t>
+            </w:r>
+          </w:p>
+          <w:p>
+            <w:pPr>
+              <w:spacing w:after="0" w:before="0"/>
+            </w:pPr>
+            <w:r>
+              <w:rPr>
+                <w:rFonts w:ascii="Consolas" w:hAnsi="Consolas"/>
+                <w:sz w:val="15"/>
+              </w:rPr>
+              <w:t xml:space="preserve">            y_test, y_pred, target_names=class_names, output_dict=True</w:t>
+            </w:r>
+          </w:p>
+          <w:p>
+            <w:pPr>
+              <w:spacing w:after="0" w:before="0"/>
+            </w:pPr>
+            <w:r>
+              <w:rPr>
+                <w:rFonts w:ascii="Consolas" w:hAnsi="Consolas"/>
+                <w:sz w:val="15"/>
+              </w:rPr>
+              <w:t xml:space="preserve">        )</w:t>
+            </w:r>
+          </w:p>
+          <w:p>
+            <w:pPr>
+              <w:spacing w:after="0" w:before="0"/>
+            </w:pPr>
+            <w:r>
+              <w:rPr>
+                <w:rFonts w:ascii="Consolas" w:hAnsi="Consolas"/>
+                <w:sz w:val="15"/>
+              </w:rPr>
+              <w:t xml:space="preserve">        st.dataframe(pd.DataFrame(report_dict).transpose())</w:t>
+            </w:r>
+          </w:p>
+          <w:p>
+            <w:pPr>
+              <w:spacing w:after="0" w:before="0"/>
+            </w:pPr>
+            <w:r>
+              <w:rPr>
+                <w:rFonts w:ascii="Consolas" w:hAnsi="Consolas"/>
+                <w:sz w:val="15"/>
+              </w:rPr>
+              <w:t xml:space="preserve"> </w:t>
+            </w:r>
+          </w:p>
+          <w:p>
+            <w:pPr>
+              <w:spacing w:after="0" w:before="0"/>
+            </w:pPr>
+            <w:r>
+              <w:rPr>
+                <w:rFonts w:ascii="Consolas" w:hAnsi="Consolas"/>
+                <w:sz w:val="15"/>
+              </w:rPr>
+              <w:t xml:space="preserve">        # ----- Confusion Matrix graph -----</w:t>
+            </w:r>
+          </w:p>
+          <w:p>
+            <w:pPr>
+              <w:spacing w:after="0" w:before="0"/>
+            </w:pPr>
+            <w:r>
+              <w:rPr>
+                <w:rFonts w:ascii="Consolas" w:hAnsi="Consolas"/>
+                <w:sz w:val="15"/>
+              </w:rPr>
+              <w:t xml:space="preserve">        st.write("**Confusion Matrix** (rows = actual, columns = predicted):")</w:t>
+            </w:r>
+          </w:p>
+          <w:p>
+            <w:pPr>
+              <w:spacing w:after="0" w:before="0"/>
+            </w:pPr>
+            <w:r>
+              <w:rPr>
+                <w:rFonts w:ascii="Consolas" w:hAnsi="Consolas"/>
+                <w:sz w:val="15"/>
+              </w:rPr>
+              <w:t xml:space="preserve">        cm = confusion_matrix(y_test, y_pred)</w:t>
+            </w:r>
+          </w:p>
+          <w:p>
+            <w:pPr>
+              <w:spacing w:after="0" w:before="0"/>
+            </w:pPr>
+            <w:r>
+              <w:rPr>
+                <w:rFonts w:ascii="Consolas" w:hAnsi="Consolas"/>
+                <w:sz w:val="15"/>
+              </w:rPr>
+              <w:t xml:space="preserve">        fig_cm, ax_cm = plt.subplots(figsize=(5, 4))</w:t>
+            </w:r>
+          </w:p>
+          <w:p>
+            <w:pPr>
+              <w:spacing w:after="0" w:before="0"/>
+            </w:pPr>
+            <w:r>
+              <w:rPr>
+                <w:rFonts w:ascii="Consolas" w:hAnsi="Consolas"/>
+                <w:sz w:val="15"/>
+              </w:rPr>
+              <w:t xml:space="preserve">        sns.heatmap(cm, annot=True, fmt="d", cmap="Blues",</w:t>
+            </w:r>
+          </w:p>
+          <w:p>
+            <w:pPr>
+              <w:spacing w:after="0" w:before="0"/>
+            </w:pPr>
+            <w:r>
+              <w:rPr>
+                <w:rFonts w:ascii="Consolas" w:hAnsi="Consolas"/>
+                <w:sz w:val="15"/>
+              </w:rPr>
+              <w:t xml:space="preserve">                    xticklabels=class_names, yticklabels=class_names, ax=ax_cm)</w:t>
+            </w:r>
+          </w:p>
+          <w:p>
+            <w:pPr>
+              <w:spacing w:after="0" w:before="0"/>
+            </w:pPr>
+            <w:r>
+              <w:rPr>
+                <w:rFonts w:ascii="Consolas" w:hAnsi="Consolas"/>
+                <w:sz w:val="15"/>
+              </w:rPr>
+              <w:t xml:space="preserve">        ax_cm.set_xlabel("Predicted")</w:t>
+            </w:r>
+          </w:p>
+          <w:p>
+            <w:pPr>
+              <w:spacing w:after="0" w:before="0"/>
+            </w:pPr>
+            <w:r>
+              <w:rPr>
+                <w:rFonts w:ascii="Consolas" w:hAnsi="Consolas"/>
+                <w:sz w:val="15"/>
+              </w:rPr>
+              <w:t xml:space="preserve">        ax_cm.set_ylabel("Actual")</w:t>
+            </w:r>
+          </w:p>
+          <w:p>
+            <w:pPr>
+              <w:spacing w:after="0" w:before="0"/>
+            </w:pPr>
+            <w:r>
+              <w:rPr>
+                <w:rFonts w:ascii="Consolas" w:hAnsi="Consolas"/>
+                <w:sz w:val="15"/>
+              </w:rPr>
+              <w:t xml:space="preserve">        st.pyplot(fig_cm)</w:t>
+            </w:r>
+          </w:p>
+          <w:p>
+            <w:pPr>
+              <w:spacing w:after="0" w:before="0"/>
+            </w:pPr>
+            <w:r>
+              <w:rPr>
+                <w:rFonts w:ascii="Consolas" w:hAnsi="Consolas"/>
+                <w:sz w:val="15"/>
+              </w:rPr>
+              <w:t xml:space="preserve"> </w:t>
+            </w:r>
+          </w:p>
+          <w:p>
+            <w:pPr>
+              <w:spacing w:after="0" w:before="0"/>
+            </w:pPr>
+            <w:r>
+              <w:rPr>
+                <w:rFonts w:ascii="Consolas" w:hAnsi="Consolas"/>
+                <w:sz w:val="15"/>
+              </w:rPr>
+              <w:t xml:space="preserve">        # ----- X_test / y_test / predictions table -----</w:t>
+            </w:r>
+          </w:p>
+          <w:p>
+            <w:pPr>
+              <w:spacing w:after="0" w:before="0"/>
+            </w:pPr>
+            <w:r>
+              <w:rPr>
+                <w:rFonts w:ascii="Consolas" w:hAnsi="Consolas"/>
+                <w:sz w:val="15"/>
+              </w:rPr>
+              <w:t xml:space="preserve">        st.write("**Test Set: Actual vs Predicted** (first 15 rows):")</w:t>
+            </w:r>
+          </w:p>
+          <w:p>
+            <w:pPr>
+              <w:spacing w:after="0" w:before="0"/>
+            </w:pPr>
+            <w:r>
+              <w:rPr>
+                <w:rFonts w:ascii="Consolas" w:hAnsi="Consolas"/>
+                <w:sz w:val="15"/>
+              </w:rPr>
+              <w:t xml:space="preserve">        results_table = X_test.copy()</w:t>
+            </w:r>
+          </w:p>
+          <w:p>
+            <w:pPr>
+              <w:spacing w:after="0" w:before="0"/>
+            </w:pPr>
+            <w:r>
+              <w:rPr>
+                <w:rFonts w:ascii="Consolas" w:hAnsi="Consolas"/>
+                <w:sz w:val="15"/>
+              </w:rPr>
+              <w:t xml:space="preserve">        results_table["Actual"] = [class_names[i] for i in y_test]</w:t>
+            </w:r>
+          </w:p>
+          <w:p>
+            <w:pPr>
+              <w:spacing w:after="0" w:before="0"/>
+            </w:pPr>
+            <w:r>
+              <w:rPr>
+                <w:rFonts w:ascii="Consolas" w:hAnsi="Consolas"/>
+                <w:sz w:val="15"/>
+              </w:rPr>
+              <w:t xml:space="preserve">        results_table["Predicted"] = [class_names[i] for i in y_pred]</w:t>
+            </w:r>
+          </w:p>
+          <w:p>
+            <w:pPr>
+              <w:spacing w:after="0" w:before="0"/>
+            </w:pPr>
+            <w:r>
+              <w:rPr>
+                <w:rFonts w:ascii="Consolas" w:hAnsi="Consolas"/>
+                <w:sz w:val="15"/>
+              </w:rPr>
+              <w:t xml:space="preserve">        st.dataframe(results_table.head(15))</w:t>
+            </w:r>
+          </w:p>
+          <w:p>
+            <w:pPr>
+              <w:spacing w:after="0" w:before="0"/>
+            </w:pPr>
+            <w:r>
+              <w:rPr>
+                <w:rFonts w:ascii="Consolas" w:hAnsi="Consolas"/>
+                <w:sz w:val="15"/>
+              </w:rPr>
+              <w:t xml:space="preserve"> </w:t>
+            </w:r>
+          </w:p>
+          <w:p>
+            <w:pPr>
+              <w:spacing w:after="0" w:before="0"/>
+            </w:pPr>
+            <w:r>
+              <w:rPr>
+                <w:rFonts w:ascii="Consolas" w:hAnsi="Consolas"/>
+                <w:sz w:val="15"/>
+              </w:rPr>
+              <w:t xml:space="preserve">        # ----- Decision Tree structure picture -----</w:t>
+            </w:r>
+          </w:p>
+          <w:p>
+            <w:pPr>
+              <w:spacing w:after="0" w:before="0"/>
+            </w:pPr>
+            <w:r>
+              <w:rPr>
+                <w:rFonts w:ascii="Consolas" w:hAnsi="Consolas"/>
+                <w:sz w:val="15"/>
+              </w:rPr>
+              <w:t xml:space="preserve">        st.subheader("4. Decision Tree Structure")</w:t>
+            </w:r>
+          </w:p>
+          <w:p>
+            <w:pPr>
+              <w:spacing w:after="0" w:before="0"/>
+            </w:pPr>
+            <w:r>
+              <w:rPr>
+                <w:rFonts w:ascii="Consolas" w:hAnsi="Consolas"/>
+                <w:sz w:val="15"/>
+              </w:rPr>
+              <w:t xml:space="preserve">        st.write("This is exactly how the model makes its decisions, step by step:")</w:t>
+            </w:r>
+          </w:p>
+          <w:p>
+            <w:pPr>
+              <w:spacing w:after="0" w:before="0"/>
+            </w:pPr>
+            <w:r>
+              <w:rPr>
+                <w:rFonts w:ascii="Consolas" w:hAnsi="Consolas"/>
+                <w:sz w:val="15"/>
+              </w:rPr>
+              <w:t xml:space="preserve">        fig_tree, ax_tree = plt.subplots(figsize=(16, 8))</w:t>
+            </w:r>
+          </w:p>
+          <w:p>
+            <w:pPr>
+              <w:spacing w:after="0" w:before="0"/>
+            </w:pPr>
+            <w:r>
+              <w:rPr>
+                <w:rFonts w:ascii="Consolas" w:hAnsi="Consolas"/>
+                <w:sz w:val="15"/>
+              </w:rPr>
+              <w:t xml:space="preserve">        plot_tree(</w:t>
+            </w:r>
+          </w:p>
+          <w:p>
+            <w:pPr>
+              <w:spacing w:after="0" w:before="0"/>
+            </w:pPr>
+            <w:r>
+              <w:rPr>
+                <w:rFonts w:ascii="Consolas" w:hAnsi="Consolas"/>
+                <w:sz w:val="15"/>
+              </w:rPr>
+              <w:t xml:space="preserve">            model,</w:t>
+            </w:r>
+          </w:p>
+          <w:p>
+            <w:pPr>
+              <w:spacing w:after="0" w:before="0"/>
+            </w:pPr>
+            <w:r>
+              <w:rPr>
+                <w:rFonts w:ascii="Consolas" w:hAnsi="Consolas"/>
+                <w:sz w:val="15"/>
+              </w:rPr>
+              <w:t xml:space="preserve">            feature_names=feature_columns,</w:t>
+            </w:r>
+          </w:p>
+          <w:p>
+            <w:pPr>
+              <w:spacing w:after="0" w:before="0"/>
+            </w:pPr>
+            <w:r>
+              <w:rPr>
+                <w:rFonts w:ascii="Consolas" w:hAnsi="Consolas"/>
+                <w:sz w:val="15"/>
+              </w:rPr>
+              <w:t xml:space="preserve">            class_names=class_names,</w:t>
+            </w:r>
+          </w:p>
+          <w:p>
+            <w:pPr>
+              <w:spacing w:after="0" w:before="0"/>
+            </w:pPr>
+            <w:r>
+              <w:rPr>
+                <w:rFonts w:ascii="Consolas" w:hAnsi="Consolas"/>
+                <w:sz w:val="15"/>
+              </w:rPr>
+              <w:t xml:space="preserve">            filled=True,</w:t>
+            </w:r>
+          </w:p>
+          <w:p>
+            <w:pPr>
+              <w:spacing w:after="0" w:before="0"/>
+            </w:pPr>
+            <w:r>
+              <w:rPr>
+                <w:rFonts w:ascii="Consolas" w:hAnsi="Consolas"/>
+                <w:sz w:val="15"/>
+              </w:rPr>
+              <w:t xml:space="preserve">            rounded=True,</w:t>
+            </w:r>
+          </w:p>
+          <w:p>
+            <w:pPr>
+              <w:spacing w:after="0" w:before="0"/>
+            </w:pPr>
+            <w:r>
+              <w:rPr>
+                <w:rFonts w:ascii="Consolas" w:hAnsi="Consolas"/>
+                <w:sz w:val="15"/>
+              </w:rPr>
+              <w:t xml:space="preserve">            fontsize=8,</w:t>
+            </w:r>
+          </w:p>
+          <w:p>
+            <w:pPr>
+              <w:spacing w:after="0" w:before="0"/>
+            </w:pPr>
+            <w:r>
+              <w:rPr>
+                <w:rFonts w:ascii="Consolas" w:hAnsi="Consolas"/>
+                <w:sz w:val="15"/>
+              </w:rPr>
+              <w:t xml:space="preserve">            ax=ax_tree,</w:t>
+            </w:r>
+          </w:p>
+          <w:p>
+            <w:pPr>
+              <w:spacing w:after="0" w:before="0"/>
+            </w:pPr>
+            <w:r>
+              <w:rPr>
+                <w:rFonts w:ascii="Consolas" w:hAnsi="Consolas"/>
+                <w:sz w:val="15"/>
+              </w:rPr>
+              <w:t xml:space="preserve">        )</w:t>
+            </w:r>
+          </w:p>
+          <w:p>
+            <w:pPr>
+              <w:spacing w:after="0" w:before="0"/>
+            </w:pPr>
+            <w:r>
+              <w:rPr>
+                <w:rFonts w:ascii="Consolas" w:hAnsi="Consolas"/>
+                <w:sz w:val="15"/>
+              </w:rPr>
+              <w:t xml:space="preserve">        st.pyplot(fig_tree)</w:t>
+            </w:r>
+          </w:p>
+          <w:p>
+            <w:pPr>
+              <w:spacing w:after="0" w:before="0"/>
+            </w:pPr>
+            <w:r>
+              <w:rPr>
+                <w:rFonts w:ascii="Consolas" w:hAnsi="Consolas"/>
+                <w:sz w:val="15"/>
+              </w:rPr>
+              <w:t xml:space="preserve"> </w:t>
+            </w:r>
+          </w:p>
+          <w:p>
+            <w:pPr>
+              <w:spacing w:after="0" w:before="0"/>
+            </w:pPr>
+            <w:r>
+              <w:rPr>
+                <w:rFonts w:ascii="Consolas" w:hAnsi="Consolas"/>
+                <w:sz w:val="15"/>
+              </w:rPr>
+              <w:t xml:space="preserve">    elif train_button and len(feature_columns) == 0:</w:t>
+            </w:r>
+          </w:p>
+          <w:p>
+            <w:pPr>
+              <w:spacing w:after="0" w:before="0"/>
+            </w:pPr>
+            <w:r>
+              <w:rPr>
+                <w:rFonts w:ascii="Consolas" w:hAnsi="Consolas"/>
+                <w:sz w:val="15"/>
+              </w:rPr>
+              <w:t xml:space="preserve">        st.error("Please select at least one feature column before training.")</w:t>
+            </w:r>
+          </w:p>
+          <w:p>
+            <w:pPr>
+              <w:spacing w:after="0" w:before="0"/>
+            </w:pPr>
+            <w:r>
+              <w:rPr>
+                <w:rFonts w:ascii="Consolas" w:hAnsi="Consolas"/>
+                <w:sz w:val="15"/>
+              </w:rPr>
+              <w:t xml:space="preserve"> </w:t>
+            </w:r>
+          </w:p>
+          <w:p>
+            <w:pPr>
+              <w:spacing w:after="0" w:before="0"/>
+            </w:pPr>
+            <w:r>
+              <w:rPr>
+                <w:rFonts w:ascii="Consolas" w:hAnsi="Consolas"/>
+                <w:sz w:val="15"/>
+              </w:rPr>
+              <w:t>else:</w:t>
+            </w:r>
+          </w:p>
+          <w:p>
+            <w:pPr>
+              <w:spacing w:after="0" w:before="0"/>
+            </w:pPr>
+            <w:r>
+              <w:rPr>
+                <w:rFonts w:ascii="Consolas" w:hAnsi="Consolas"/>
+                <w:sz w:val="15"/>
+              </w:rPr>
+              <w:t xml:space="preserve">    st.info("Upload a CSV file above to get started.")</w:t>
+            </w:r>
+          </w:p>
+        </w:tc>
+      </w:tr>
+    </w:tbl>
+    <w:p>
+      <w:pPr>
+        <w:spacing w:after="80"/>
+      </w:pPr>
+    </w:p>
+    <w:p>
+      <w:r>
+        <w:br w:type="page"/>
+      </w:r>
+    </w:p>
+    <w:p>
+      <w:pPr>
+        <w:spacing w:before="200" w:after="80"/>
+      </w:pPr>
+      <w:r>
+        <w:rPr>
+          <w:b/>
+          <w:color w:val="1F3A5F"/>
+          <w:sz w:val="26"/>
+        </w:rPr>
+        <w:t>4. Project Screenshots</w:t>
+      </w:r>
+    </w:p>
+    <w:p>
+      <w:pPr>
+        <w:spacing w:after="120"/>
+      </w:pPr>
+      <w:r>
+        <w:rPr>
+          <w:sz w:val="21"/>
+        </w:rPr>
+        <w:t>The following screenshots show the working web application end-to-end.</w:t>
+      </w:r>
+    </w:p>
+    <w:p>
+      <w:pPr>
+        <w:jc w:val="center"/>
+      </w:pPr>
+      <w:r>
+        <w:drawing>
+          <wp:inline xmlns:a="http://schemas.openxmlformats.org/drawingml/2006/main" xmlns:pic="http://schemas.openxmlformats.org/drawingml/2006/picture">
+            <wp:extent cx="5486400" cy="4714875"/>
+            <wp:docPr id="1" name="Picture 1"/>
+            <wp:cNvGraphicFramePr>
+              <a:graphicFrameLocks noChangeAspect="1"/>
+            </wp:cNvGraphicFramePr>
+            <a:graphic>
+              <a:graphicData uri="http://schemas.openxmlformats.org/drawingml/2006/picture">
+                <pic:pic>
+                  <pic:nvPicPr>
+                    <pic:cNvPr id="0" name="screenshot_upload.png"/>
+                    <pic:cNvPicPr/>
+                  </pic:nvPicPr>
+                  <pic:blipFill>
+                    <a:blip r:embed="rId9"/>
+                    <a:stretch>
+                      <a:fillRect/>
+                    </a:stretch>
+                  </pic:blipFill>
+                  <pic:spPr>
+                    <a:xfrm>
+                      <a:off x="0" y="0"/>
+                      <a:ext cx="5486400" cy="4714875"/>
+                    </a:xfrm>
+                    <a:prstGeom prst="rect"/>
+                  </pic:spPr>
+                </pic:pic>
+              </a:graphicData>
+            </a:graphic>
+          </wp:inline>
+        </w:drawing>
+      </w:r>
+    </w:p>
+    <w:p>
+      <w:pPr>
+        <w:spacing w:after="200"/>
+        <w:jc w:val="center"/>
+      </w:pPr>
+      <w:r>
+        <w:rPr>
+          <w:i/>
+          <w:sz w:val="19"/>
+        </w:rPr>
+        <w:t>Figure 1: Dataset uploaded (mushroom_classification.csv) with target/feature column selection</w:t>
+      </w:r>
+    </w:p>
+    <w:p>
+      <w:pPr>
+        <w:jc w:val="center"/>
+      </w:pPr>
+      <w:r>
+        <w:drawing>
+          <wp:inline xmlns:a="http://schemas.openxmlformats.org/drawingml/2006/main" xmlns:pic="http://schemas.openxmlformats.org/drawingml/2006/picture">
+            <wp:extent cx="5486400" cy="4714875"/>
+            <wp:docPr id="2" name="Picture 2"/>
+            <wp:cNvGraphicFramePr>
+              <a:graphicFrameLocks noChangeAspect="1"/>
+            </wp:cNvGraphicFramePr>
+            <a:graphic>
+              <a:graphicData uri="http://schemas.openxmlformats.org/drawingml/2006/picture">
+                <pic:pic>
+                  <pic:nvPicPr>
+                    <pic:cNvPr id="0" name="screenshot_confusion.png"/>
+                    <pic:cNvPicPr/>
+                  </pic:nvPicPr>
+                  <pic:blipFill>
+                    <a:blip r:embed="rId10"/>
+                    <a:stretch>
+                      <a:fillRect/>
+                    </a:stretch>
+                  </pic:blipFill>
+                  <pic:spPr>
+                    <a:xfrm>
+                      <a:off x="0" y="0"/>
+                      <a:ext cx="5486400" cy="4714875"/>
+                    </a:xfrm>
+                    <a:prstGeom prst="rect"/>
+                  </pic:spPr>
+                </pic:pic>
+              </a:graphicData>
+            </a:graphic>
+          </wp:inline>
+        </w:drawing>
+      </w:r>
+    </w:p>
+    <w:p>
+      <w:pPr>
+        <w:spacing w:after="200"/>
+        <w:jc w:val="center"/>
+      </w:pPr>
+      <w:r>
+        <w:rPr>
+          <w:i/>
+          <w:sz w:val="19"/>
+        </w:rPr>
+        <w:t>Figure 2: Test accuracy (97.48%), classification report, and confusion matrix</w:t>
+      </w:r>
+    </w:p>
+    <w:p>
+      <w:pPr>
+        <w:jc w:val="center"/>
+      </w:pPr>
+      <w:r>
+        <w:drawing>
+          <wp:inline xmlns:a="http://schemas.openxmlformats.org/drawingml/2006/main" xmlns:pic="http://schemas.openxmlformats.org/drawingml/2006/picture">
+            <wp:extent cx="5486400" cy="4714875"/>
+            <wp:docPr id="3" name="Picture 3"/>
+            <wp:cNvGraphicFramePr>
+              <a:graphicFrameLocks noChangeAspect="1"/>
+            </wp:cNvGraphicFramePr>
+            <a:graphic>
+              <a:graphicData uri="http://schemas.openxmlformats.org/drawingml/2006/picture">
+                <pic:pic>
+                  <pic:nvPicPr>
+                    <pic:cNvPr id="0" name="screenshot_tree.png"/>
+                    <pic:cNvPicPr/>
+                  </pic:nvPicPr>
+                  <pic:blipFill>
+                    <a:blip r:embed="rId11"/>
+                    <a:stretch>
+                      <a:fillRect/>
+                    </a:stretch>
+                  </pic:blipFill>
+                  <pic:spPr>
+                    <a:xfrm>
+                      <a:off x="0" y="0"/>
+                      <a:ext cx="5486400" cy="4714875"/>
+                    </a:xfrm>
+                    <a:prstGeom prst="rect"/>
+                  </pic:spPr>
+                </pic:pic>
+              </a:graphicData>
+            </a:graphic>
+          </wp:inline>
+        </w:drawing>
+      </w:r>
+    </w:p>
+    <w:p>
+      <w:pPr>
+        <w:spacing w:after="200"/>
+        <w:jc w:val="center"/>
+      </w:pPr>
+      <w:r>
+        <w:rPr>
+          <w:i/>
+          <w:sz w:val="19"/>
+        </w:rPr>
+        <w:t>Figure 3: X_test/y_test predictions table and the trained Decision Tree structure</w:t>
+      </w:r>
+    </w:p>
     <w:sectPr>
       <w:pgSz w:w="12240" w:h="15840"/>
-      <w:pgMar w:top="1000" w:right="1200" w:bottom="1000" w:left="1200" w:header="720" w:footer="720" w:gutter="0"/>
+      <w:pgMar w:top="1000" w:right="1100" w:bottom="1000" w:left="1100" w:header="720" w:footer="720" w:gutter="0"/>
       <w:cols w:space="720"/>
       <w:docGrid w:linePitch="360"/>
     </w:sectPr>

</xml_diff>